<commit_message>
Adding Week 4 file
</commit_message>
<xml_diff>
--- a/Meeting Reports/Meeting Report- Week 3.docx
+++ b/Meeting Reports/Meeting Report- Week 3.docx
@@ -1107,38 +1107,683 @@
           <w:u w:val="single"/>
         </w:rPr>
       </w:pPr>
+    </w:p>
+    <w:p>
+      <w:pPr>
+        <w:rPr>
+          <w:rFonts w:ascii="Arial" w:hAnsi="Arial"/>
+          <w:b/>
+          <w:sz w:val="22"/>
+          <w:u w:val="single"/>
+        </w:rPr>
+      </w:pPr>
+      <w:r>
+        <w:rPr>
+          <w:rFonts w:ascii="Arial" w:hAnsi="Arial"/>
+          <w:b/>
+          <w:sz w:val="22"/>
+          <w:u w:val="single"/>
+        </w:rPr>
+        <w:lastRenderedPageBreak/>
+        <w:t>Tasks Assigned:</w:t>
+      </w:r>
+    </w:p>
+    <w:p>
+      <w:pPr>
+        <w:rPr>
+          <w:rFonts w:ascii="Arial" w:hAnsi="Arial"/>
+          <w:b/>
+          <w:sz w:val="22"/>
+          <w:u w:val="single"/>
+        </w:rPr>
+      </w:pPr>
+    </w:p>
+    <w:p>
+      <w:pPr>
+        <w:rPr>
+          <w:rFonts w:ascii="Arial" w:hAnsi="Arial"/>
+          <w:sz w:val="22"/>
+          <w:lang w:val="en-DE"/>
+        </w:rPr>
+      </w:pPr>
+      <w:r>
+        <w:rPr>
+          <w:rFonts w:ascii="Arial" w:hAnsi="Arial"/>
+          <w:b/>
+          <w:sz w:val="22"/>
+          <w:lang w:val="en-DE"/>
+        </w:rPr>
+        <w:t xml:space="preserve">Kevin </w:t>
+      </w:r>
+      <w:proofErr w:type="spellStart"/>
+      <w:r>
+        <w:rPr>
+          <w:rFonts w:ascii="Arial" w:hAnsi="Arial"/>
+          <w:b/>
+          <w:sz w:val="22"/>
+          <w:lang w:val="en-DE"/>
+        </w:rPr>
+        <w:t>Muho</w:t>
+      </w:r>
+      <w:proofErr w:type="spellEnd"/>
+      <w:r>
+        <w:rPr>
+          <w:rFonts w:ascii="Arial" w:hAnsi="Arial"/>
+          <w:b/>
+          <w:sz w:val="22"/>
+          <w:lang w:val="en-DE"/>
+        </w:rPr>
+        <w:t>-</w:t>
+      </w:r>
+      <w:r>
+        <w:rPr>
+          <w:rFonts w:ascii="Arial" w:hAnsi="Arial"/>
+          <w:sz w:val="22"/>
+          <w:lang w:val="en-DE"/>
+        </w:rPr>
+        <w:t xml:space="preserve"> Designing a single use case diagram for the whole software</w:t>
+      </w:r>
+      <w:r>
+        <w:rPr>
+          <w:rFonts w:ascii="Arial" w:hAnsi="Arial"/>
+          <w:sz w:val="22"/>
+          <w:lang w:val="en-DE"/>
+        </w:rPr>
+        <w:t>.</w:t>
+      </w:r>
+    </w:p>
+    <w:p>
+      <w:pPr>
+        <w:rPr>
+          <w:rFonts w:ascii="Arial" w:hAnsi="Arial"/>
+          <w:sz w:val="22"/>
+          <w:lang w:val="en-DE"/>
+        </w:rPr>
+      </w:pPr>
+    </w:p>
+    <w:p>
+      <w:pPr>
+        <w:rPr>
+          <w:rFonts w:ascii="Arial" w:hAnsi="Arial"/>
+          <w:sz w:val="22"/>
+          <w:lang w:val="en-DE"/>
+        </w:rPr>
+      </w:pPr>
+      <w:proofErr w:type="spellStart"/>
+      <w:r>
+        <w:rPr>
+          <w:rFonts w:ascii="Arial" w:hAnsi="Arial"/>
+          <w:b/>
+          <w:sz w:val="22"/>
+          <w:lang w:val="en-DE"/>
+        </w:rPr>
+        <w:t>Haidi</w:t>
+      </w:r>
+      <w:proofErr w:type="spellEnd"/>
+      <w:r>
+        <w:rPr>
+          <w:rFonts w:ascii="Arial" w:hAnsi="Arial"/>
+          <w:b/>
+          <w:sz w:val="22"/>
+          <w:lang w:val="en-DE"/>
+        </w:rPr>
+        <w:t xml:space="preserve"> Toto, </w:t>
+      </w:r>
+      <w:proofErr w:type="spellStart"/>
+      <w:r>
+        <w:rPr>
+          <w:rFonts w:ascii="Arial" w:hAnsi="Arial"/>
+          <w:b/>
+          <w:sz w:val="22"/>
+          <w:lang w:val="en-DE"/>
+        </w:rPr>
+        <w:t>Ledio</w:t>
+      </w:r>
+      <w:proofErr w:type="spellEnd"/>
+      <w:r>
+        <w:rPr>
+          <w:rFonts w:ascii="Arial" w:hAnsi="Arial"/>
+          <w:b/>
+          <w:sz w:val="22"/>
+          <w:lang w:val="en-DE"/>
+        </w:rPr>
+        <w:t xml:space="preserve"> </w:t>
+      </w:r>
+      <w:proofErr w:type="spellStart"/>
+      <w:r>
+        <w:rPr>
+          <w:rFonts w:ascii="Arial" w:hAnsi="Arial"/>
+          <w:b/>
+          <w:sz w:val="22"/>
+          <w:lang w:val="en-DE"/>
+        </w:rPr>
+        <w:t>Tafciu</w:t>
+      </w:r>
+      <w:proofErr w:type="spellEnd"/>
+      <w:r>
+        <w:rPr>
+          <w:rFonts w:ascii="Arial" w:hAnsi="Arial"/>
+          <w:b/>
+          <w:sz w:val="22"/>
+          <w:lang w:val="en-DE"/>
+        </w:rPr>
+        <w:t>-</w:t>
+      </w:r>
+      <w:r>
+        <w:rPr>
+          <w:rFonts w:ascii="Arial" w:hAnsi="Arial"/>
+          <w:sz w:val="22"/>
+          <w:lang w:val="en-DE"/>
+        </w:rPr>
+        <w:t xml:space="preserve"> Working on last week’s suggestions in order to improve the requirements of the software</w:t>
+      </w:r>
+      <w:r>
+        <w:rPr>
+          <w:rFonts w:ascii="Arial" w:hAnsi="Arial"/>
+          <w:sz w:val="22"/>
+          <w:lang w:val="en-DE"/>
+        </w:rPr>
+        <w:t>.</w:t>
+      </w:r>
+    </w:p>
+    <w:p>
+      <w:pPr>
+        <w:rPr>
+          <w:rFonts w:ascii="Arial" w:hAnsi="Arial"/>
+          <w:sz w:val="22"/>
+          <w:lang w:val="en-DE"/>
+        </w:rPr>
+      </w:pPr>
+    </w:p>
+    <w:p>
+      <w:pPr>
+        <w:rPr>
+          <w:rFonts w:ascii="Arial" w:hAnsi="Arial"/>
+          <w:sz w:val="22"/>
+          <w:lang w:val="en-DE"/>
+        </w:rPr>
+      </w:pPr>
+      <w:r>
+        <w:rPr>
+          <w:rFonts w:ascii="Arial" w:hAnsi="Arial"/>
+          <w:b/>
+          <w:sz w:val="22"/>
+          <w:lang w:val="en-DE"/>
+        </w:rPr>
+        <w:t xml:space="preserve">Anisa </w:t>
+      </w:r>
+      <w:proofErr w:type="spellStart"/>
+      <w:r>
+        <w:rPr>
+          <w:rFonts w:ascii="Arial" w:hAnsi="Arial"/>
+          <w:b/>
+          <w:sz w:val="22"/>
+          <w:lang w:val="en-DE"/>
+        </w:rPr>
+        <w:t>Domi</w:t>
+      </w:r>
+      <w:proofErr w:type="spellEnd"/>
+      <w:r>
+        <w:rPr>
+          <w:rFonts w:ascii="Arial" w:hAnsi="Arial"/>
+          <w:b/>
+          <w:sz w:val="22"/>
+          <w:lang w:val="en-DE"/>
+        </w:rPr>
+        <w:t xml:space="preserve">, </w:t>
+      </w:r>
+      <w:proofErr w:type="spellStart"/>
+      <w:r>
+        <w:rPr>
+          <w:rFonts w:ascii="Arial" w:hAnsi="Arial"/>
+          <w:b/>
+          <w:sz w:val="22"/>
+          <w:lang w:val="en-DE"/>
+        </w:rPr>
+        <w:t>Ornelt</w:t>
+      </w:r>
+      <w:proofErr w:type="spellEnd"/>
+      <w:r>
+        <w:rPr>
+          <w:rFonts w:ascii="Arial" w:hAnsi="Arial"/>
+          <w:b/>
+          <w:sz w:val="22"/>
+          <w:lang w:val="en-DE"/>
+        </w:rPr>
+        <w:t xml:space="preserve"> </w:t>
+      </w:r>
+      <w:proofErr w:type="spellStart"/>
+      <w:r>
+        <w:rPr>
+          <w:rFonts w:ascii="Arial" w:hAnsi="Arial"/>
+          <w:b/>
+          <w:sz w:val="22"/>
+          <w:lang w:val="en-DE"/>
+        </w:rPr>
+        <w:t>Lemellari</w:t>
+      </w:r>
+      <w:proofErr w:type="spellEnd"/>
+      <w:r>
+        <w:rPr>
+          <w:rFonts w:ascii="Arial" w:hAnsi="Arial"/>
+          <w:b/>
+          <w:sz w:val="22"/>
+          <w:lang w:val="en-DE"/>
+        </w:rPr>
+        <w:t>, Matias Bali</w:t>
+      </w:r>
+      <w:r>
+        <w:rPr>
+          <w:rFonts w:ascii="Arial" w:hAnsi="Arial"/>
+          <w:b/>
+          <w:sz w:val="22"/>
+          <w:lang w:val="en-DE"/>
+        </w:rPr>
+        <w:t xml:space="preserve">,Kevin </w:t>
+      </w:r>
+      <w:proofErr w:type="spellStart"/>
+      <w:r>
+        <w:rPr>
+          <w:rFonts w:ascii="Arial" w:hAnsi="Arial"/>
+          <w:b/>
+          <w:sz w:val="22"/>
+          <w:lang w:val="en-DE"/>
+        </w:rPr>
+        <w:t>Muho,Desard</w:t>
+      </w:r>
+      <w:proofErr w:type="spellEnd"/>
+      <w:r>
+        <w:rPr>
+          <w:rFonts w:ascii="Arial" w:hAnsi="Arial"/>
+          <w:b/>
+          <w:sz w:val="22"/>
+          <w:lang w:val="en-DE"/>
+        </w:rPr>
+        <w:t xml:space="preserve"> </w:t>
+      </w:r>
+      <w:proofErr w:type="spellStart"/>
+      <w:r>
+        <w:rPr>
+          <w:rFonts w:ascii="Arial" w:hAnsi="Arial"/>
+          <w:b/>
+          <w:sz w:val="22"/>
+          <w:lang w:val="en-DE"/>
+        </w:rPr>
+        <w:t>Lybeshari,Haidi</w:t>
+      </w:r>
+      <w:proofErr w:type="spellEnd"/>
+      <w:r>
+        <w:rPr>
+          <w:rFonts w:ascii="Arial" w:hAnsi="Arial"/>
+          <w:b/>
+          <w:sz w:val="22"/>
+          <w:lang w:val="en-DE"/>
+        </w:rPr>
+        <w:t xml:space="preserve"> </w:t>
+      </w:r>
+      <w:proofErr w:type="spellStart"/>
+      <w:r>
+        <w:rPr>
+          <w:rFonts w:ascii="Arial" w:hAnsi="Arial"/>
+          <w:b/>
+          <w:sz w:val="22"/>
+          <w:lang w:val="en-DE"/>
+        </w:rPr>
+        <w:t>Toto,Ledio</w:t>
+      </w:r>
+      <w:proofErr w:type="spellEnd"/>
+      <w:r>
+        <w:rPr>
+          <w:rFonts w:ascii="Arial" w:hAnsi="Arial"/>
+          <w:b/>
+          <w:sz w:val="22"/>
+          <w:lang w:val="en-DE"/>
+        </w:rPr>
+        <w:t xml:space="preserve"> </w:t>
+      </w:r>
+      <w:proofErr w:type="spellStart"/>
+      <w:r>
+        <w:rPr>
+          <w:rFonts w:ascii="Arial" w:hAnsi="Arial"/>
+          <w:b/>
+          <w:sz w:val="22"/>
+          <w:lang w:val="en-DE"/>
+        </w:rPr>
+        <w:t>Tafciu</w:t>
+      </w:r>
+      <w:proofErr w:type="spellEnd"/>
+      <w:r>
+        <w:rPr>
+          <w:rFonts w:ascii="Arial" w:hAnsi="Arial"/>
+          <w:b/>
+          <w:sz w:val="22"/>
+          <w:lang w:val="en-DE"/>
+        </w:rPr>
+        <w:t>-</w:t>
+      </w:r>
+      <w:r>
+        <w:rPr>
+          <w:rFonts w:ascii="Arial" w:hAnsi="Arial"/>
+          <w:sz w:val="22"/>
+          <w:lang w:val="en-DE"/>
+        </w:rPr>
+        <w:t xml:space="preserve"> Use Case</w:t>
+      </w:r>
+      <w:r>
+        <w:rPr>
+          <w:rFonts w:ascii="Arial" w:hAnsi="Arial"/>
+          <w:sz w:val="22"/>
+          <w:lang w:val="en-DE"/>
+        </w:rPr>
+        <w:t xml:space="preserve"> tables </w:t>
+      </w:r>
+      <w:r>
+        <w:rPr>
+          <w:rFonts w:ascii="Arial" w:hAnsi="Arial"/>
+          <w:sz w:val="22"/>
+          <w:lang w:val="en-DE"/>
+        </w:rPr>
+        <w:t>for each functional requirement w</w:t>
+      </w:r>
       <w:bookmarkStart w:id="0" w:name="_GoBack"/>
       <w:bookmarkEnd w:id="0"/>
-    </w:p>
-    <w:p>
-      <w:pPr>
-        <w:rPr>
-          <w:rFonts w:ascii="Arial" w:hAnsi="Arial"/>
-          <w:b/>
-          <w:sz w:val="22"/>
-          <w:u w:val="single"/>
-        </w:rPr>
-      </w:pPr>
-      <w:r>
-        <w:rPr>
-          <w:rFonts w:ascii="Arial" w:hAnsi="Arial"/>
-          <w:b/>
-          <w:sz w:val="22"/>
-          <w:u w:val="single"/>
-        </w:rPr>
-        <w:lastRenderedPageBreak/>
-        <w:t>Tasks Assigned:</w:t>
-      </w:r>
-    </w:p>
-    <w:p>
-      <w:pPr>
-        <w:rPr>
-          <w:rFonts w:ascii="Arial" w:hAnsi="Arial"/>
-          <w:b/>
-          <w:sz w:val="22"/>
-          <w:u w:val="single"/>
-        </w:rPr>
-      </w:pPr>
+      <w:r>
+        <w:rPr>
+          <w:rFonts w:ascii="Arial" w:hAnsi="Arial"/>
+          <w:sz w:val="22"/>
+          <w:lang w:val="en-DE"/>
+        </w:rPr>
+        <w:t>ritten according to the table format given during the lecture.</w:t>
+      </w:r>
+    </w:p>
+    <w:p>
+      <w:pPr>
+        <w:rPr>
+          <w:rFonts w:ascii="Arial" w:hAnsi="Arial"/>
+          <w:sz w:val="22"/>
+          <w:lang w:val="en-DE"/>
+        </w:rPr>
+      </w:pPr>
+    </w:p>
+    <w:p>
+      <w:pPr>
+        <w:rPr>
+          <w:rFonts w:ascii="Arial" w:hAnsi="Arial"/>
+          <w:sz w:val="22"/>
+          <w:lang w:val="en-DE"/>
+        </w:rPr>
+      </w:pPr>
+      <w:r>
+        <w:rPr>
+          <w:rFonts w:ascii="Arial" w:hAnsi="Arial"/>
+          <w:b/>
+          <w:sz w:val="22"/>
+          <w:lang w:val="en-DE"/>
+        </w:rPr>
+        <w:t xml:space="preserve">Anisa </w:t>
+      </w:r>
+      <w:proofErr w:type="spellStart"/>
+      <w:r>
+        <w:rPr>
+          <w:rFonts w:ascii="Arial" w:hAnsi="Arial"/>
+          <w:b/>
+          <w:sz w:val="22"/>
+          <w:lang w:val="en-DE"/>
+        </w:rPr>
+        <w:t>Domi</w:t>
+      </w:r>
+      <w:proofErr w:type="spellEnd"/>
+      <w:r>
+        <w:rPr>
+          <w:rFonts w:ascii="Arial" w:hAnsi="Arial"/>
+          <w:b/>
+          <w:sz w:val="22"/>
+          <w:lang w:val="en-DE"/>
+        </w:rPr>
+        <w:t xml:space="preserve"> –</w:t>
+      </w:r>
+      <w:r>
+        <w:rPr>
+          <w:rFonts w:ascii="Arial" w:hAnsi="Arial"/>
+          <w:sz w:val="22"/>
+          <w:lang w:val="en-DE"/>
+        </w:rPr>
+        <w:t xml:space="preserve"> Functional Requirement no.1-no.6</w:t>
+      </w:r>
+    </w:p>
+    <w:p>
+      <w:pPr>
+        <w:rPr>
+          <w:rFonts w:ascii="Arial" w:hAnsi="Arial"/>
+          <w:sz w:val="22"/>
+          <w:lang w:val="en-DE"/>
+        </w:rPr>
+      </w:pPr>
+      <w:proofErr w:type="spellStart"/>
+      <w:r>
+        <w:rPr>
+          <w:rFonts w:ascii="Arial" w:hAnsi="Arial"/>
+          <w:b/>
+          <w:sz w:val="22"/>
+          <w:lang w:val="en-DE"/>
+        </w:rPr>
+        <w:t>Haidi</w:t>
+      </w:r>
+      <w:proofErr w:type="spellEnd"/>
+      <w:r>
+        <w:rPr>
+          <w:rFonts w:ascii="Arial" w:hAnsi="Arial"/>
+          <w:b/>
+          <w:sz w:val="22"/>
+          <w:lang w:val="en-DE"/>
+        </w:rPr>
+        <w:t xml:space="preserve"> Toto –</w:t>
+      </w:r>
+      <w:r>
+        <w:rPr>
+          <w:rFonts w:ascii="Arial" w:hAnsi="Arial"/>
+          <w:sz w:val="22"/>
+          <w:lang w:val="en-DE"/>
+        </w:rPr>
+        <w:t xml:space="preserve"> Functional Requirement no.7-no.12</w:t>
+      </w:r>
+    </w:p>
+    <w:p>
+      <w:pPr>
+        <w:rPr>
+          <w:rFonts w:ascii="Arial" w:hAnsi="Arial"/>
+          <w:sz w:val="22"/>
+          <w:lang w:val="en-DE"/>
+        </w:rPr>
+      </w:pPr>
+      <w:proofErr w:type="spellStart"/>
+      <w:r>
+        <w:rPr>
+          <w:rFonts w:ascii="Arial" w:hAnsi="Arial"/>
+          <w:b/>
+          <w:sz w:val="22"/>
+          <w:lang w:val="en-DE"/>
+        </w:rPr>
+        <w:t>Ledio</w:t>
+      </w:r>
+      <w:proofErr w:type="spellEnd"/>
+      <w:r>
+        <w:rPr>
+          <w:rFonts w:ascii="Arial" w:hAnsi="Arial"/>
+          <w:b/>
+          <w:sz w:val="22"/>
+          <w:lang w:val="en-DE"/>
+        </w:rPr>
+        <w:t xml:space="preserve"> </w:t>
+      </w:r>
+      <w:proofErr w:type="spellStart"/>
+      <w:r>
+        <w:rPr>
+          <w:rFonts w:ascii="Arial" w:hAnsi="Arial"/>
+          <w:b/>
+          <w:sz w:val="22"/>
+          <w:lang w:val="en-DE"/>
+        </w:rPr>
+        <w:t>Tafciu</w:t>
+      </w:r>
+      <w:proofErr w:type="spellEnd"/>
+      <w:r>
+        <w:rPr>
+          <w:rFonts w:ascii="Arial" w:hAnsi="Arial"/>
+          <w:b/>
+          <w:sz w:val="22"/>
+          <w:lang w:val="en-DE"/>
+        </w:rPr>
+        <w:t xml:space="preserve"> – </w:t>
+      </w:r>
+      <w:r>
+        <w:rPr>
+          <w:rFonts w:ascii="Arial" w:hAnsi="Arial"/>
+          <w:sz w:val="22"/>
+          <w:lang w:val="en-DE"/>
+        </w:rPr>
+        <w:t>Functional Requirement no.13-no.18</w:t>
+      </w:r>
+    </w:p>
+    <w:p>
+      <w:pPr>
+        <w:rPr>
+          <w:rFonts w:ascii="Arial" w:hAnsi="Arial"/>
+          <w:sz w:val="22"/>
+          <w:lang w:val="en-DE"/>
+        </w:rPr>
+      </w:pPr>
+      <w:proofErr w:type="spellStart"/>
+      <w:r>
+        <w:rPr>
+          <w:rFonts w:ascii="Arial" w:hAnsi="Arial"/>
+          <w:b/>
+          <w:sz w:val="22"/>
+          <w:lang w:val="en-DE"/>
+        </w:rPr>
+        <w:t>Desard</w:t>
+      </w:r>
+      <w:proofErr w:type="spellEnd"/>
+      <w:r>
+        <w:rPr>
+          <w:rFonts w:ascii="Arial" w:hAnsi="Arial"/>
+          <w:b/>
+          <w:sz w:val="22"/>
+          <w:lang w:val="en-DE"/>
+        </w:rPr>
+        <w:t xml:space="preserve"> </w:t>
+      </w:r>
+      <w:proofErr w:type="spellStart"/>
+      <w:r>
+        <w:rPr>
+          <w:rFonts w:ascii="Arial" w:hAnsi="Arial"/>
+          <w:b/>
+          <w:sz w:val="22"/>
+          <w:lang w:val="en-DE"/>
+        </w:rPr>
+        <w:t>Lybeshari</w:t>
+      </w:r>
+      <w:proofErr w:type="spellEnd"/>
+      <w:r>
+        <w:rPr>
+          <w:rFonts w:ascii="Arial" w:hAnsi="Arial"/>
+          <w:b/>
+          <w:sz w:val="22"/>
+          <w:lang w:val="en-DE"/>
+        </w:rPr>
+        <w:t xml:space="preserve"> – </w:t>
+      </w:r>
+      <w:r>
+        <w:rPr>
+          <w:rFonts w:ascii="Arial" w:hAnsi="Arial"/>
+          <w:sz w:val="22"/>
+          <w:lang w:val="en-DE"/>
+        </w:rPr>
+        <w:t>Functional Requirement no.19-no.24</w:t>
+      </w:r>
+    </w:p>
+    <w:p>
+      <w:pPr>
+        <w:rPr>
+          <w:rFonts w:ascii="Arial" w:hAnsi="Arial"/>
+          <w:sz w:val="22"/>
+          <w:lang w:val="en-DE"/>
+        </w:rPr>
+      </w:pPr>
+      <w:r>
+        <w:rPr>
+          <w:rFonts w:ascii="Arial" w:hAnsi="Arial"/>
+          <w:b/>
+          <w:sz w:val="22"/>
+          <w:lang w:val="en-DE"/>
+        </w:rPr>
+        <w:t xml:space="preserve">Matias Bali – </w:t>
+      </w:r>
+      <w:r>
+        <w:rPr>
+          <w:rFonts w:ascii="Arial" w:hAnsi="Arial"/>
+          <w:sz w:val="22"/>
+          <w:lang w:val="en-DE"/>
+        </w:rPr>
+        <w:t>Functional Requirement no.25-no.30</w:t>
+      </w:r>
+    </w:p>
+    <w:p>
+      <w:pPr>
+        <w:rPr>
+          <w:rFonts w:ascii="Arial" w:hAnsi="Arial"/>
+          <w:sz w:val="22"/>
+          <w:lang w:val="en-DE"/>
+        </w:rPr>
+      </w:pPr>
+      <w:proofErr w:type="spellStart"/>
+      <w:r>
+        <w:rPr>
+          <w:rFonts w:ascii="Arial" w:hAnsi="Arial"/>
+          <w:b/>
+          <w:sz w:val="22"/>
+          <w:lang w:val="en-DE"/>
+        </w:rPr>
+        <w:t>Ornelt</w:t>
+      </w:r>
+      <w:proofErr w:type="spellEnd"/>
+      <w:r>
+        <w:rPr>
+          <w:rFonts w:ascii="Arial" w:hAnsi="Arial"/>
+          <w:b/>
+          <w:sz w:val="22"/>
+          <w:lang w:val="en-DE"/>
+        </w:rPr>
+        <w:t xml:space="preserve"> </w:t>
+      </w:r>
+      <w:proofErr w:type="spellStart"/>
+      <w:r>
+        <w:rPr>
+          <w:rFonts w:ascii="Arial" w:hAnsi="Arial"/>
+          <w:b/>
+          <w:sz w:val="22"/>
+          <w:lang w:val="en-DE"/>
+        </w:rPr>
+        <w:t>Lemellari</w:t>
+      </w:r>
+      <w:proofErr w:type="spellEnd"/>
+      <w:r>
+        <w:rPr>
+          <w:rFonts w:ascii="Arial" w:hAnsi="Arial"/>
+          <w:b/>
+          <w:sz w:val="22"/>
+          <w:lang w:val="en-DE"/>
+        </w:rPr>
+        <w:t xml:space="preserve"> – </w:t>
+      </w:r>
+      <w:r>
+        <w:rPr>
+          <w:rFonts w:ascii="Arial" w:hAnsi="Arial"/>
+          <w:sz w:val="22"/>
+          <w:lang w:val="en-DE"/>
+        </w:rPr>
+        <w:t>Functional Requirement no.31-no.36</w:t>
+      </w:r>
     </w:p>
     <w:p>
       <w:pPr>
@@ -1175,236 +1820,32 @@
           <w:sz w:val="22"/>
           <w:lang w:val="en-DE"/>
         </w:rPr>
-        <w:t xml:space="preserve">, </w:t>
-      </w:r>
-      <w:proofErr w:type="spellStart"/>
-      <w:r>
-        <w:rPr>
-          <w:rFonts w:ascii="Arial" w:hAnsi="Arial"/>
-          <w:b/>
-          <w:sz w:val="22"/>
-          <w:lang w:val="en-DE"/>
-        </w:rPr>
-        <w:t>Desard</w:t>
-      </w:r>
-      <w:proofErr w:type="spellEnd"/>
-      <w:r>
-        <w:rPr>
-          <w:rFonts w:ascii="Arial" w:hAnsi="Arial"/>
-          <w:b/>
+        <w:t xml:space="preserve"> – </w:t>
+      </w:r>
+      <w:r>
+        <w:rPr>
+          <w:rFonts w:ascii="Arial" w:hAnsi="Arial"/>
+          <w:sz w:val="22"/>
+          <w:lang w:val="en-DE"/>
+        </w:rPr>
+        <w:t>Functional Requirement no.37-no.42</w:t>
+      </w:r>
+    </w:p>
+    <w:p>
+      <w:pPr>
+        <w:rPr>
+          <w:rFonts w:ascii="Arial" w:hAnsi="Arial"/>
+          <w:sz w:val="22"/>
+          <w:lang w:val="en-DE"/>
+        </w:rPr>
+      </w:pPr>
+      <w:r>
+        <w:rPr>
+          <w:rFonts w:ascii="Arial" w:hAnsi="Arial"/>
           <w:sz w:val="22"/>
           <w:lang w:val="en-DE"/>
         </w:rPr>
         <w:t xml:space="preserve"> </w:t>
-      </w:r>
-      <w:proofErr w:type="spellStart"/>
-      <w:r>
-        <w:rPr>
-          <w:rFonts w:ascii="Arial" w:hAnsi="Arial"/>
-          <w:b/>
-          <w:sz w:val="22"/>
-          <w:lang w:val="en-DE"/>
-        </w:rPr>
-        <w:t>Lybeshari</w:t>
-      </w:r>
-      <w:proofErr w:type="spellEnd"/>
-      <w:r>
-        <w:rPr>
-          <w:rFonts w:ascii="Arial" w:hAnsi="Arial"/>
-          <w:b/>
-          <w:sz w:val="22"/>
-          <w:lang w:val="en-DE"/>
-        </w:rPr>
-        <w:t>-</w:t>
-      </w:r>
-      <w:r>
-        <w:rPr>
-          <w:rFonts w:ascii="Arial" w:hAnsi="Arial"/>
-          <w:sz w:val="22"/>
-          <w:lang w:val="en-DE"/>
-        </w:rPr>
-        <w:t xml:space="preserve"> Designing a single use case diagram for the whole software, doing some uses cases for functional requirements written according to the table format</w:t>
-      </w:r>
-    </w:p>
-    <w:p>
-      <w:pPr>
-        <w:rPr>
-          <w:rFonts w:ascii="Arial" w:hAnsi="Arial"/>
-          <w:sz w:val="22"/>
-          <w:lang w:val="en-DE"/>
-        </w:rPr>
-      </w:pPr>
-    </w:p>
-    <w:p>
-      <w:pPr>
-        <w:rPr>
-          <w:rFonts w:ascii="Arial" w:hAnsi="Arial"/>
-          <w:sz w:val="22"/>
-          <w:lang w:val="en-DE"/>
-        </w:rPr>
-      </w:pPr>
-      <w:proofErr w:type="spellStart"/>
-      <w:r>
-        <w:rPr>
-          <w:rFonts w:ascii="Arial" w:hAnsi="Arial"/>
-          <w:b/>
-          <w:sz w:val="22"/>
-          <w:lang w:val="en-DE"/>
-        </w:rPr>
-        <w:t>Haidi</w:t>
-      </w:r>
-      <w:proofErr w:type="spellEnd"/>
-      <w:r>
-        <w:rPr>
-          <w:rFonts w:ascii="Arial" w:hAnsi="Arial"/>
-          <w:b/>
-          <w:sz w:val="22"/>
-          <w:lang w:val="en-DE"/>
-        </w:rPr>
-        <w:t xml:space="preserve"> Toto, </w:t>
-      </w:r>
-      <w:proofErr w:type="spellStart"/>
-      <w:r>
-        <w:rPr>
-          <w:rFonts w:ascii="Arial" w:hAnsi="Arial"/>
-          <w:b/>
-          <w:sz w:val="22"/>
-          <w:lang w:val="en-DE"/>
-        </w:rPr>
-        <w:t>Ledio</w:t>
-      </w:r>
-      <w:proofErr w:type="spellEnd"/>
-      <w:r>
-        <w:rPr>
-          <w:rFonts w:ascii="Arial" w:hAnsi="Arial"/>
-          <w:b/>
-          <w:sz w:val="22"/>
-          <w:lang w:val="en-DE"/>
-        </w:rPr>
-        <w:t xml:space="preserve"> </w:t>
-      </w:r>
-      <w:proofErr w:type="spellStart"/>
-      <w:r>
-        <w:rPr>
-          <w:rFonts w:ascii="Arial" w:hAnsi="Arial"/>
-          <w:b/>
-          <w:sz w:val="22"/>
-          <w:lang w:val="en-DE"/>
-        </w:rPr>
-        <w:t>Tafciu</w:t>
-      </w:r>
-      <w:proofErr w:type="spellEnd"/>
-      <w:r>
-        <w:rPr>
-          <w:rFonts w:ascii="Arial" w:hAnsi="Arial"/>
-          <w:b/>
-          <w:sz w:val="22"/>
-          <w:lang w:val="en-DE"/>
-        </w:rPr>
-        <w:t>-</w:t>
-      </w:r>
-      <w:r>
-        <w:rPr>
-          <w:rFonts w:ascii="Arial" w:hAnsi="Arial"/>
-          <w:sz w:val="22"/>
-          <w:lang w:val="en-DE"/>
-        </w:rPr>
-        <w:t xml:space="preserve"> Working on last week’s suggestions in order to improve the requirements of the software</w:t>
-      </w:r>
-    </w:p>
-    <w:p>
-      <w:pPr>
-        <w:rPr>
-          <w:rFonts w:ascii="Arial" w:hAnsi="Arial"/>
-          <w:sz w:val="22"/>
-          <w:lang w:val="en-DE"/>
-        </w:rPr>
-      </w:pPr>
-    </w:p>
-    <w:p>
-      <w:pPr>
-        <w:rPr>
-          <w:rFonts w:ascii="Arial" w:hAnsi="Arial"/>
-          <w:sz w:val="22"/>
-          <w:lang w:val="en-DE"/>
-        </w:rPr>
-      </w:pPr>
-      <w:r>
-        <w:rPr>
-          <w:rFonts w:ascii="Arial" w:hAnsi="Arial"/>
-          <w:b/>
-          <w:sz w:val="22"/>
-          <w:lang w:val="en-DE"/>
-        </w:rPr>
-        <w:t xml:space="preserve">Anisa </w:t>
-      </w:r>
-      <w:proofErr w:type="spellStart"/>
-      <w:r>
-        <w:rPr>
-          <w:rFonts w:ascii="Arial" w:hAnsi="Arial"/>
-          <w:b/>
-          <w:sz w:val="22"/>
-          <w:lang w:val="en-DE"/>
-        </w:rPr>
-        <w:t>Domi</w:t>
-      </w:r>
-      <w:proofErr w:type="spellEnd"/>
-      <w:r>
-        <w:rPr>
-          <w:rFonts w:ascii="Arial" w:hAnsi="Arial"/>
-          <w:b/>
-          <w:sz w:val="22"/>
-          <w:lang w:val="en-DE"/>
-        </w:rPr>
-        <w:t xml:space="preserve">, </w:t>
-      </w:r>
-      <w:proofErr w:type="spellStart"/>
-      <w:r>
-        <w:rPr>
-          <w:rFonts w:ascii="Arial" w:hAnsi="Arial"/>
-          <w:b/>
-          <w:sz w:val="22"/>
-          <w:lang w:val="en-DE"/>
-        </w:rPr>
-        <w:t>Ornelt</w:t>
-      </w:r>
-      <w:proofErr w:type="spellEnd"/>
-      <w:r>
-        <w:rPr>
-          <w:rFonts w:ascii="Arial" w:hAnsi="Arial"/>
-          <w:b/>
-          <w:sz w:val="22"/>
-          <w:lang w:val="en-DE"/>
-        </w:rPr>
-        <w:t xml:space="preserve"> </w:t>
-      </w:r>
-      <w:proofErr w:type="spellStart"/>
-      <w:r>
-        <w:rPr>
-          <w:rFonts w:ascii="Arial" w:hAnsi="Arial"/>
-          <w:b/>
-          <w:sz w:val="22"/>
-          <w:lang w:val="en-DE"/>
-        </w:rPr>
-        <w:t>Lemellari</w:t>
-      </w:r>
-      <w:proofErr w:type="spellEnd"/>
-      <w:r>
-        <w:rPr>
-          <w:rFonts w:ascii="Arial" w:hAnsi="Arial"/>
-          <w:b/>
-          <w:sz w:val="22"/>
-          <w:lang w:val="en-DE"/>
-        </w:rPr>
-        <w:t>, Matias Bali-</w:t>
-      </w:r>
-      <w:r>
-        <w:rPr>
-          <w:rFonts w:ascii="Arial" w:hAnsi="Arial"/>
-          <w:sz w:val="22"/>
-          <w:lang w:val="en-DE"/>
-        </w:rPr>
-        <w:t xml:space="preserve"> Use Cases for each functional requirement written according to the table format given during the lecture. </w:t>
       </w:r>
     </w:p>
     <w:p>

</xml_diff>